<commit_message>
Add phase D results (Civil Comments, Amazon polarity, Yelp), update final report and docs
Co-Authored-By: Claude Sonnet 5.5 <noreply@anthropic.com>
Claude-Session: https://claude.ai/code/session_01Q1RoAMr7AGRCD4cuNgQnXj
</commit_message>
<xml_diff>
--- a/report/LexFront_Final_Report.docx
+++ b/report/LexFront_Final_Report.docx
@@ -75,7 +75,7 @@
           <w:sz w:val="24"/>
           <w:szCs w:val="24"/>
         </w:rPr>
-        <w:t xml:space="preserve">Text from social media is full of hashtags, mentions, links, emoticons and stretched-out words, and the tokenizers that most classifiers rely on were not designed with this in mind. In this project we ask whether a lexical analyzer built the way a compiler builds one can do a better job. We built LexFront, a lexer with eleven token classes, longest-match scanning, error recovery, a symbol table and six switchable normalization rules. We also wrote our own engine that turns regular expressions into an NFA, then a DFA, then a minimized DFA. The experiments run on a PLY-based lexer, and our engine is checked against it, because it reproduces the same tokens on four of the token classes. LexFront was compared with whitespace splitting, NLTK and TweetTokenizer, and with BPE, WordPiece and Unigram subword tokenizers, with the classifier kept the same each time. We tested on three core datasets, on a collection of eight cleaned datasets with fair classifier tuning, and on three large datasets: Sentiment140 (1.6 million tweets), Civil Comments and Amazon polarity (about 500,000 training examples each).</w:t>
+        <w:t xml:space="preserve">Text from social media is full of hashtags, mentions, links, emoticons and stretched-out words, and the tokenizers that most classifiers rely on were not designed with this in mind. In this project we ask whether a lexical analyzer built the way a compiler builds one can do a better job. We built LexFront, a lexer with eleven token classes, longest-match scanning, error recovery, a symbol table and six switchable normalization rules. We also wrote our own engine that turns regular expressions into an NFA, then a DFA, then a minimized DFA. The experiments run on a PLY-based lexer, and our engine is checked against it, because it reproduces the same tokens on four of the token classes. LexFront was compared with whitespace splitting, NLTK and TweetTokenizer, and with BPE, WordPiece and Unigram subword tokenizers, with the classifier kept the same each time. We tested on three core datasets, on a collection of eight cleaned datasets with fair classifier tuning, and on four large datasets: Sentiment140 (1.6 million tweets), Civil Comments and Amazon polarity (about 500,000 training examples each), and Yelp reviews with five star classes (about 300,000 training examples).</w:t>
       </w:r>
     </w:p>
     <w:p>
@@ -89,7 +89,7 @@
           <w:sz w:val="24"/>
           <w:szCs w:val="24"/>
         </w:rPr>
-        <w:t xml:space="preserve">The answer is the same everywhere we looked: LexFront is competitive, but it is not better. With the tokenizer as the only change, its accuracy stays close to NLTK and TweetTokenizer on the large datasets, with wide-tuned differences from 0.00 to +0.46 points, and it is clearly ahead only of plain whitespace splitting. It does give the lowest out-of-vocabulary rate and the smallest vocabulary among the word-level tokenizers, and it loses slightly less accuracy when noise is added to the test text. Most of the accuracy we measured comes from the classifier and its tuning, not from the tokenizer: moving from Naive Bayes to Logistic Regression is worth up to 17 points, and wider validated settings add 2 to 3 points for Logistic Regression on the large datasets. The subword tokenizers and a character n-gram baseline did not help either. We report these results with confidence intervals and with the hypotheses that did not hold.</w:t>
+        <w:t xml:space="preserve">The answer is the same everywhere we looked: LexFront is competitive, but it is not better. With the tokenizer as the only change, its accuracy stays close to NLTK and TweetTokenizer on the large datasets, with wide-tuned differences from 0.00 to +0.46 points, and it is clearly ahead only of plain whitespace splitting. It does give the lowest out-of-vocabulary rate and the smallest vocabulary among the word-level tokenizers, and it loses slightly less accuracy when noise is added to the test text. Most of the accuracy we measured comes from the classifier and its tuning, not from the tokenizer: moving from Naive Bayes to Logistic Regression is worth up to 17 points, and wider validated settings add 2 to 3 points for Logistic Regression on Sentiment140, Amazon polarity and Yelp. The subword tokenizers and a character n-gram baseline did not help either. We report these results with confidence intervals and with the hypotheses that did not hold.</w:t>
       </w:r>
     </w:p>
     <w:p>
@@ -173,7 +173,7 @@
           <w:sz w:val="24"/>
           <w:szCs w:val="24"/>
         </w:rPr>
-        <w:t xml:space="preserve">The work in this report makes four contributions. First, we built LexFront, a lexer with a priority-ordered token specification, a normalizer and a symbol table, together with our own regex-to-DFA engine that implements Thompson construction, subset construction and Moore minimization. Second, we set up a controlled comparison in which the tokenizer is the only thing that changes, with confidence intervals and significance tests so that small differences are not over-read. Third, we ran ablations that switch each normalization rule off separately, and a subword extension that combines LexFront with BPE and compares it with WordPiece and Unigram [4]. Fourth, we checked how far the results hold up with a fair tuning protocol, a collection of eight cleaned datasets, and three large datasets with hypotheses written down before the runs. Section 2 reviews the literature, Section 3 describes the proposed system and its five modules, Section 4 gives the implementation and results, Section 5 compares performance, and Section 6 concludes.</w:t>
+        <w:t xml:space="preserve">The work in this report makes four contributions. First, we built LexFront, a lexer with a priority-ordered token specification, a normalizer and a symbol table, together with our own regex-to-DFA engine that implements Thompson construction, subset construction and Moore minimization. Second, we set up a controlled comparison in which the tokenizer is the only thing that changes, with confidence intervals and significance tests so that small differences are not over-read. Third, we ran ablations that switch each normalization rule off separately, and a subword extension that combines LexFront with BPE and compares it with WordPiece and Unigram [4]. Fourth, we checked how far the results hold up with a fair tuning protocol, a collection of eight cleaned datasets, and four large datasets with hypotheses written down before the runs. Section 2 reviews the literature, Section 3 describes the proposed system and its five modules, Section 4 gives the implementation and results, Section 5 compares performance, and Section 6 concludes.</w:t>
       </w:r>
     </w:p>
     <w:p>
@@ -2996,7 +2996,7 @@
           <w:sz w:val="24"/>
           <w:szCs w:val="24"/>
         </w:rPr>
-        <w:t xml:space="preserve">The system is written in Python and every number below was read from the JSON result files in the repository, which are written by the scripts we ran. The core datasets use full data with no subsampling. For the two large datasets Civil Comments and Amazon polarity we took a seeded random sample of about 500,000 training examples, and Sentiment140 is used in full after cleaning. Each cell is a single training run. The 95% confidence intervals are paired percentile bootstraps over the test examples, with McNemar's test for accuracy on the core datasets. They cover the draw of the test set, not training randomness.</w:t>
+        <w:t xml:space="preserve">The system is written in Python and every number below was read from the JSON result files in the repository, which are written by the scripts we ran. The core datasets use full data with no subsampling. For Civil Comments and Amazon polarity we took a seeded random sample of about 500,000 training examples, for Yelp 300,000 training and 50,000 test examples, and Sentiment140 is used in full after cleaning. Each cell is a single training run. The 95% confidence intervals are paired percentile bootstraps over the test examples, with McNemar's test for accuracy on the core datasets. They cover the draw of the test set, not training randomness.</w:t>
       </w:r>
     </w:p>
     <w:p>
@@ -3026,7 +3026,7 @@
           <w:sz w:val="24"/>
           <w:szCs w:val="24"/>
         </w:rPr>
-        <w:t xml:space="preserve">We used English datasets that differ in style and size, in three groups. The core group has three datasets used in Modules 1 to 4: tweet_topic [40] has tweets labelled with six topics, go_emotions [41] has Reddit comments labelled with 28 emotion classes (we kept only the single-label examples), and ag_news [42] has news articles in four categories. The first two are noisy and informal, while ag_news is relatively clean, which gives a useful contrast. The collection group adds five tweet_eval tasks (sentiment, emotion, irony, hate and offensive language), so that together with the core datasets there are eight cleaned datasets. The large group has Sentiment140 (1.6 million tweets, split by user), Civil Comments (comments with a toxicity label, where the toxic class is rare) and Amazon polarity (product reviews). Table 1 lists the core and large datasets, and the last column is the share of the largest class in the test set, which is also the accuracy of the majority baseline. For the large datasets the sizes are after cleaning and, for Civil Comments and Amazon polarity, after taking a seeded random sample of about 500,000 training examples.</w:t>
+        <w:t xml:space="preserve">We used English datasets that differ in style and size, in three groups. The core group has three datasets used in Modules 1 to 4: tweet_topic [40] has tweets labelled with six topics, go_emotions [41] has Reddit comments labelled with 28 emotion classes (we kept only the single-label examples), and ag_news [42] has news articles in four categories. The first two are noisy and informal, while ag_news is relatively clean, which gives a useful contrast. The collection group adds five tweet_eval tasks (sentiment, emotion, irony, hate and offensive language), so that together with the core datasets there are eight cleaned datasets. The large group has Sentiment140 (1.6 million tweets, split by user), Civil Comments (comments with a toxicity label, where the toxic class is rare), Amazon polarity (product reviews) and Yelp (reviews with five star classes, which tests a many-class problem). Table 1 lists the core and large datasets, and the last column is the share of the largest class in the test set, which is also the accuracy of the majority baseline. For the large datasets the sizes are after cleaning and, for Civil Comments and Amazon polarity, after taking a seeded random sample of about 500,000 training examples (300,000 training and 50,000 test examples for Yelp).</w:t>
       </w:r>
     </w:p>
     <w:p>
@@ -4328,6 +4328,186 @@
                 <w:szCs w:val="19"/>
               </w:rPr>
               <w:t xml:space="preserve">50.04</w:t>
+            </w:r>
+          </w:p>
+        </w:tc>
+      </w:tr>
+      <w:tr>
+        <w:trPr>
+          <w:cantSplit/>
+          <w:tblHeader w:val="false"/>
+        </w:trPr>
+        <w:tc>
+          <w:tcPr>
+            <w:tcW w:type="dxa" w:w="1700"/>
+            <w:tcBorders>
+              <w:top w:val="single" w:color="888888" w:sz="4"/>
+              <w:left w:val="single" w:color="888888" w:sz="4"/>
+              <w:bottom w:val="single" w:color="888888" w:sz="4"/>
+              <w:right w:val="single" w:color="888888" w:sz="4"/>
+            </w:tcBorders>
+            <w:tcMar>
+              <w:top w:type="dxa" w:w="50"/>
+              <w:left w:type="dxa" w:w="80"/>
+              <w:bottom w:type="dxa" w:w="50"/>
+              <w:right w:type="dxa" w:w="80"/>
+            </w:tcMar>
+          </w:tcPr>
+          <w:p>
+            <w:r>
+              <w:rPr>
+                <w:rFonts w:ascii="Times New Roman" w:cs="Times New Roman" w:eastAsia="Times New Roman" w:hAnsi="Times New Roman"/>
+                <w:b w:val="false"/>
+                <w:bCs w:val="false"/>
+                <w:sz w:val="19"/>
+                <w:szCs w:val="19"/>
+              </w:rPr>
+              <w:t xml:space="preserve">Yelp reviews</w:t>
+            </w:r>
+          </w:p>
+        </w:tc>
+        <w:tc>
+          <w:tcPr>
+            <w:tcW w:type="dxa" w:w="2900"/>
+            <w:tcBorders>
+              <w:top w:val="single" w:color="888888" w:sz="4"/>
+              <w:left w:val="single" w:color="888888" w:sz="4"/>
+              <w:bottom w:val="single" w:color="888888" w:sz="4"/>
+              <w:right w:val="single" w:color="888888" w:sz="4"/>
+            </w:tcBorders>
+            <w:tcMar>
+              <w:top w:type="dxa" w:w="50"/>
+              <w:left w:type="dxa" w:w="80"/>
+              <w:bottom w:type="dxa" w:w="50"/>
+              <w:right w:type="dxa" w:w="80"/>
+            </w:tcMar>
+          </w:tcPr>
+          <w:p>
+            <w:r>
+              <w:rPr>
+                <w:rFonts w:ascii="Times New Roman" w:cs="Times New Roman" w:eastAsia="Times New Roman" w:hAnsi="Times New Roman"/>
+                <w:b w:val="false"/>
+                <w:bCs w:val="false"/>
+                <w:sz w:val="19"/>
+                <w:szCs w:val="19"/>
+              </w:rPr>
+              <w:t xml:space="preserve">Yelp/yelp_review_full</w:t>
+            </w:r>
+          </w:p>
+        </w:tc>
+        <w:tc>
+          <w:tcPr>
+            <w:tcW w:type="dxa" w:w="1200"/>
+            <w:tcBorders>
+              <w:top w:val="single" w:color="888888" w:sz="4"/>
+              <w:left w:val="single" w:color="888888" w:sz="4"/>
+              <w:bottom w:val="single" w:color="888888" w:sz="4"/>
+              <w:right w:val="single" w:color="888888" w:sz="4"/>
+            </w:tcBorders>
+            <w:tcMar>
+              <w:top w:type="dxa" w:w="50"/>
+              <w:left w:type="dxa" w:w="80"/>
+              <w:bottom w:type="dxa" w:w="50"/>
+              <w:right w:type="dxa" w:w="80"/>
+            </w:tcMar>
+          </w:tcPr>
+          <w:p>
+            <w:r>
+              <w:rPr>
+                <w:rFonts w:ascii="Times New Roman" w:cs="Times New Roman" w:eastAsia="Times New Roman" w:hAnsi="Times New Roman"/>
+                <w:b w:val="false"/>
+                <w:bCs w:val="false"/>
+                <w:sz w:val="19"/>
+                <w:szCs w:val="19"/>
+              </w:rPr>
+              <w:t xml:space="preserve">299,979</w:t>
+            </w:r>
+          </w:p>
+        </w:tc>
+        <w:tc>
+          <w:tcPr>
+            <w:tcW w:type="dxa" w:w="1200"/>
+            <w:tcBorders>
+              <w:top w:val="single" w:color="888888" w:sz="4"/>
+              <w:left w:val="single" w:color="888888" w:sz="4"/>
+              <w:bottom w:val="single" w:color="888888" w:sz="4"/>
+              <w:right w:val="single" w:color="888888" w:sz="4"/>
+            </w:tcBorders>
+            <w:tcMar>
+              <w:top w:type="dxa" w:w="50"/>
+              <w:left w:type="dxa" w:w="80"/>
+              <w:bottom w:type="dxa" w:w="50"/>
+              <w:right w:type="dxa" w:w="80"/>
+            </w:tcMar>
+          </w:tcPr>
+          <w:p>
+            <w:r>
+              <w:rPr>
+                <w:rFonts w:ascii="Times New Roman" w:cs="Times New Roman" w:eastAsia="Times New Roman" w:hAnsi="Times New Roman"/>
+                <w:b w:val="false"/>
+                <w:bCs w:val="false"/>
+                <w:sz w:val="19"/>
+                <w:szCs w:val="19"/>
+              </w:rPr>
+              <w:t xml:space="preserve">49,994</w:t>
+            </w:r>
+          </w:p>
+        </w:tc>
+        <w:tc>
+          <w:tcPr>
+            <w:tcW w:type="dxa" w:w="1100"/>
+            <w:tcBorders>
+              <w:top w:val="single" w:color="888888" w:sz="4"/>
+              <w:left w:val="single" w:color="888888" w:sz="4"/>
+              <w:bottom w:val="single" w:color="888888" w:sz="4"/>
+              <w:right w:val="single" w:color="888888" w:sz="4"/>
+            </w:tcBorders>
+            <w:tcMar>
+              <w:top w:type="dxa" w:w="50"/>
+              <w:left w:type="dxa" w:w="80"/>
+              <w:bottom w:type="dxa" w:w="50"/>
+              <w:right w:type="dxa" w:w="80"/>
+            </w:tcMar>
+          </w:tcPr>
+          <w:p>
+            <w:r>
+              <w:rPr>
+                <w:rFonts w:ascii="Times New Roman" w:cs="Times New Roman" w:eastAsia="Times New Roman" w:hAnsi="Times New Roman"/>
+                <w:b w:val="false"/>
+                <w:bCs w:val="false"/>
+                <w:sz w:val="19"/>
+                <w:szCs w:val="19"/>
+              </w:rPr>
+              <w:t xml:space="preserve">5</w:t>
+            </w:r>
+          </w:p>
+        </w:tc>
+        <w:tc>
+          <w:tcPr>
+            <w:tcW w:type="dxa" w:w="1400"/>
+            <w:tcBorders>
+              <w:top w:val="single" w:color="888888" w:sz="4"/>
+              <w:left w:val="single" w:color="888888" w:sz="4"/>
+              <w:bottom w:val="single" w:color="888888" w:sz="4"/>
+              <w:right w:val="single" w:color="888888" w:sz="4"/>
+            </w:tcBorders>
+            <w:tcMar>
+              <w:top w:type="dxa" w:w="50"/>
+              <w:left w:type="dxa" w:w="80"/>
+              <w:bottom w:type="dxa" w:w="50"/>
+              <w:right w:type="dxa" w:w="80"/>
+            </w:tcMar>
+          </w:tcPr>
+          <w:p>
+            <w:r>
+              <w:rPr>
+                <w:rFonts w:ascii="Times New Roman" w:cs="Times New Roman" w:eastAsia="Times New Roman" w:hAnsi="Times New Roman"/>
+                <w:b w:val="false"/>
+                <w:bCs w:val="false"/>
+                <w:sz w:val="19"/>
+                <w:szCs w:val="19"/>
+              </w:rPr>
+              <w:t xml:space="preserve">20.00</w:t>
             </w:r>
           </w:p>
         </w:tc>
@@ -15436,7 +15616,7 @@
           <w:sz w:val="26"/>
           <w:szCs w:val="26"/>
         </w:rPr>
-        <w:t xml:space="preserve">4.9 Module 5: Civil Comments and Amazon polarity</w:t>
+        <w:t xml:space="preserve">4.9 Module 5: Civil Comments, Amazon polarity and Yelp</w:t>
       </w:r>
     </w:p>
     <w:p>
@@ -15450,7 +15630,21 @@
           <w:sz w:val="24"/>
           <w:szCs w:val="24"/>
         </w:rPr>
-        <w:t xml:space="preserve">To see whether Sentiment140 is typical, we ran the same protocol on two more large datasets, each with about 500,000 training examples. Civil Comments is a comments dataset where the toxic class is rare (the majority class alone gives 92.02% accuracy), so we use macro-F1 as the primary metric there. Amazon polarity is clean review text and acts as a control. Table 12 gives the wide-tuned results. On Civil Comments, LexFront, NLTK and TweetTokenizer are essentially tied, and all three are clearly ahead of whitespace splitting in macro-F1: LexFront minus whitespace is +2.25 points [+1.79, +2.70] for Logistic Regression, and with default settings +4.03. On Amazon, LexFront and TweetTokenizer are level with each other (-0.01 [-0.09, +0.07]) and both are ahead of NLTK, with LexFront minus NLTK at +0.46 [+0.34, +0.57]. That interval is above zero but crosses the 0.5-point margin, so we label it unclear and not a clear gain. Wider settings help a lot here: +2.8 to +3.3 points for Logistic Regression and +5.7 to +6.7 for Naive Bayes on Amazon.</w:t>
+        <w:t xml:space="preserve">To see whether Sentiment140 is typical, we ran the same protocol on three more large datasets: Civil Comments and Amazon polarity with about 500,000 training examples each, and Yelp with about 300,000. Civil Comments is a comments dataset where the toxic class is rare (the majority class alone gives 92.02% accuracy), so we use macro-F1 as the primary metric there. Amazon polarity is clean review text and acts as a control. Table 12 gives the wide-tuned results. On Civil Comments, LexFront, NLTK and TweetTokenizer are essentially tied, and all three are clearly ahead of whitespace splitting in macro-F1: LexFront minus whitespace is +2.25 points [+1.79, +2.70] for Logistic Regression, and with default settings +4.03. On Amazon, LexFront and TweetTokenizer are level with each other (-0.01 [-0.09, +0.07]) and both are ahead of NLTK, with LexFront minus NLTK at +0.46 [+0.34, +0.57]. That interval is above zero but crosses the 0.5-point margin, so we label it unclear and not a clear gain. Wider settings help a lot here: +2.8 to +3.3 points for Logistic Regression and +5.7 to +6.7 for Naive Bayes on Amazon.</w:t>
+      </w:r>
+    </w:p>
+    <w:p>
+      <w:pPr>
+        <w:spacing w:after="160" w:line="320"/>
+        <w:jc w:val="both"/>
+      </w:pPr>
+      <w:r>
+        <w:rPr>
+          <w:rFonts w:ascii="Times New Roman" w:cs="Times New Roman" w:eastAsia="Times New Roman" w:hAnsi="Times New Roman"/>
+          <w:sz w:val="24"/>
+          <w:szCs w:val="24"/>
+        </w:rPr>
+        <w:t xml:space="preserve">Yelp has five star classes (balanced, so the majority class gives 20.00%), which makes it the one many-class large test. The result is again the same. With wide settings and Logistic Regression, LexFront minus NLTK is +0.07 points [-0.16, +0.31] and LexFront minus TweetTokenizer is -0.15 [-0.37, +0.07], both inside the margin, while LexFront is +1.08 [+0.76, +1.38] ahead of whitespace splitting, which is beyond the margin. With Naive Bayes, LexFront minus NLTK is -0.09 [-0.28, +0.11]. Wide settings add +2.63 to +3.15 points for Logistic Regression and +5.4 to +6.3 for Naive Bayes compared with default settings, again much more than any difference between the word tokenizers.</w:t>
       </w:r>
     </w:p>
     <w:p>
@@ -15467,7 +15661,7 @@
           <w:sz w:val="20"/>
           <w:szCs w:val="20"/>
         </w:rPr>
-        <w:t xml:space="preserve">Table 12. Wide-tuned test results, accuracy / macro-F1 (%) (results/boost_civil_comments, results/boost_amazon_polarity)</w:t>
+        <w:t xml:space="preserve">Table 12. Wide-tuned test results, accuracy / macro-F1 (%) (results/boost_civil_comments, results/boost_amazon_polarity, results/boost_yelp_full)</w:t>
       </w:r>
     </w:p>
     <w:tbl>
@@ -17116,6 +17310,726 @@
           </w:p>
         </w:tc>
       </w:tr>
+      <w:tr>
+        <w:trPr>
+          <w:cantSplit/>
+          <w:tblHeader w:val="false"/>
+        </w:trPr>
+        <w:tc>
+          <w:tcPr>
+            <w:tcW w:type="dxa" w:w="1900"/>
+            <w:tcBorders>
+              <w:top w:val="single" w:color="888888" w:sz="4"/>
+              <w:left w:val="single" w:color="888888" w:sz="4"/>
+              <w:bottom w:val="single" w:color="888888" w:sz="4"/>
+              <w:right w:val="single" w:color="888888" w:sz="4"/>
+            </w:tcBorders>
+            <w:tcMar>
+              <w:top w:type="dxa" w:w="50"/>
+              <w:left w:type="dxa" w:w="80"/>
+              <w:bottom w:type="dxa" w:w="50"/>
+              <w:right w:type="dxa" w:w="80"/>
+            </w:tcMar>
+          </w:tcPr>
+          <w:p>
+            <w:r>
+              <w:rPr>
+                <w:rFonts w:ascii="Times New Roman" w:cs="Times New Roman" w:eastAsia="Times New Roman" w:hAnsi="Times New Roman"/>
+                <w:b w:val="false"/>
+                <w:bCs w:val="false"/>
+                <w:sz w:val="19"/>
+                <w:szCs w:val="19"/>
+              </w:rPr>
+              <w:t xml:space="preserve">Yelp</w:t>
+            </w:r>
+          </w:p>
+        </w:tc>
+        <w:tc>
+          <w:tcPr>
+            <w:tcW w:type="dxa" w:w="1500"/>
+            <w:tcBorders>
+              <w:top w:val="single" w:color="888888" w:sz="4"/>
+              <w:left w:val="single" w:color="888888" w:sz="4"/>
+              <w:bottom w:val="single" w:color="888888" w:sz="4"/>
+              <w:right w:val="single" w:color="888888" w:sz="4"/>
+            </w:tcBorders>
+            <w:tcMar>
+              <w:top w:type="dxa" w:w="50"/>
+              <w:left w:type="dxa" w:w="80"/>
+              <w:bottom w:type="dxa" w:w="50"/>
+              <w:right w:type="dxa" w:w="80"/>
+            </w:tcMar>
+          </w:tcPr>
+          <w:p>
+            <w:r>
+              <w:rPr>
+                <w:rFonts w:ascii="Times New Roman" w:cs="Times New Roman" w:eastAsia="Times New Roman" w:hAnsi="Times New Roman"/>
+                <w:b w:val="false"/>
+                <w:bCs w:val="false"/>
+                <w:sz w:val="19"/>
+                <w:szCs w:val="19"/>
+              </w:rPr>
+              <w:t xml:space="preserve">whitespace</w:t>
+            </w:r>
+          </w:p>
+        </w:tc>
+        <w:tc>
+          <w:tcPr>
+            <w:tcW w:type="dxa" w:w="1500"/>
+            <w:tcBorders>
+              <w:top w:val="single" w:color="888888" w:sz="4"/>
+              <w:left w:val="single" w:color="888888" w:sz="4"/>
+              <w:bottom w:val="single" w:color="888888" w:sz="4"/>
+              <w:right w:val="single" w:color="888888" w:sz="4"/>
+            </w:tcBorders>
+            <w:tcMar>
+              <w:top w:type="dxa" w:w="50"/>
+              <w:left w:type="dxa" w:w="80"/>
+              <w:bottom w:type="dxa" w:w="50"/>
+              <w:right w:type="dxa" w:w="80"/>
+            </w:tcMar>
+          </w:tcPr>
+          <w:p>
+            <w:r>
+              <w:rPr>
+                <w:rFonts w:ascii="Times New Roman" w:cs="Times New Roman" w:eastAsia="Times New Roman" w:hAnsi="Times New Roman"/>
+                <w:b w:val="false"/>
+                <w:bCs w:val="false"/>
+                <w:sz w:val="19"/>
+                <w:szCs w:val="19"/>
+              </w:rPr>
+              <w:t xml:space="preserve">61.67</w:t>
+            </w:r>
+          </w:p>
+        </w:tc>
+        <w:tc>
+          <w:tcPr>
+            <w:tcW w:type="dxa" w:w="1500"/>
+            <w:tcBorders>
+              <w:top w:val="single" w:color="888888" w:sz="4"/>
+              <w:left w:val="single" w:color="888888" w:sz="4"/>
+              <w:bottom w:val="single" w:color="888888" w:sz="4"/>
+              <w:right w:val="single" w:color="888888" w:sz="4"/>
+            </w:tcBorders>
+            <w:tcMar>
+              <w:top w:type="dxa" w:w="50"/>
+              <w:left w:type="dxa" w:w="80"/>
+              <w:bottom w:type="dxa" w:w="50"/>
+              <w:right w:type="dxa" w:w="80"/>
+            </w:tcMar>
+          </w:tcPr>
+          <w:p>
+            <w:r>
+              <w:rPr>
+                <w:rFonts w:ascii="Times New Roman" w:cs="Times New Roman" w:eastAsia="Times New Roman" w:hAnsi="Times New Roman"/>
+                <w:b w:val="false"/>
+                <w:bCs w:val="false"/>
+                <w:sz w:val="19"/>
+                <w:szCs w:val="19"/>
+              </w:rPr>
+              <w:t xml:space="preserve">61.51</w:t>
+            </w:r>
+          </w:p>
+        </w:tc>
+        <w:tc>
+          <w:tcPr>
+            <w:tcW w:type="dxa" w:w="1500"/>
+            <w:tcBorders>
+              <w:top w:val="single" w:color="888888" w:sz="4"/>
+              <w:left w:val="single" w:color="888888" w:sz="4"/>
+              <w:bottom w:val="single" w:color="888888" w:sz="4"/>
+              <w:right w:val="single" w:color="888888" w:sz="4"/>
+            </w:tcBorders>
+            <w:tcMar>
+              <w:top w:type="dxa" w:w="50"/>
+              <w:left w:type="dxa" w:w="80"/>
+              <w:bottom w:type="dxa" w:w="50"/>
+              <w:right w:type="dxa" w:w="80"/>
+            </w:tcMar>
+          </w:tcPr>
+          <w:p>
+            <w:r>
+              <w:rPr>
+                <w:rFonts w:ascii="Times New Roman" w:cs="Times New Roman" w:eastAsia="Times New Roman" w:hAnsi="Times New Roman"/>
+                <w:b w:val="false"/>
+                <w:bCs w:val="false"/>
+                <w:sz w:val="19"/>
+                <w:szCs w:val="19"/>
+              </w:rPr>
+              <w:t xml:space="preserve">58.54</w:t>
+            </w:r>
+          </w:p>
+        </w:tc>
+        <w:tc>
+          <w:tcPr>
+            <w:tcW w:type="dxa" w:w="1500"/>
+            <w:tcBorders>
+              <w:top w:val="single" w:color="888888" w:sz="4"/>
+              <w:left w:val="single" w:color="888888" w:sz="4"/>
+              <w:bottom w:val="single" w:color="888888" w:sz="4"/>
+              <w:right w:val="single" w:color="888888" w:sz="4"/>
+            </w:tcBorders>
+            <w:tcMar>
+              <w:top w:type="dxa" w:w="50"/>
+              <w:left w:type="dxa" w:w="80"/>
+              <w:bottom w:type="dxa" w:w="50"/>
+              <w:right w:type="dxa" w:w="80"/>
+            </w:tcMar>
+          </w:tcPr>
+          <w:p>
+            <w:r>
+              <w:rPr>
+                <w:rFonts w:ascii="Times New Roman" w:cs="Times New Roman" w:eastAsia="Times New Roman" w:hAnsi="Times New Roman"/>
+                <w:b w:val="false"/>
+                <w:bCs w:val="false"/>
+                <w:sz w:val="19"/>
+                <w:szCs w:val="19"/>
+              </w:rPr>
+              <w:t xml:space="preserve">58.60</w:t>
+            </w:r>
+          </w:p>
+        </w:tc>
+      </w:tr>
+      <w:tr>
+        <w:trPr>
+          <w:cantSplit/>
+          <w:tblHeader w:val="false"/>
+        </w:trPr>
+        <w:tc>
+          <w:tcPr>
+            <w:tcW w:type="dxa" w:w="1900"/>
+            <w:tcBorders>
+              <w:top w:val="single" w:color="888888" w:sz="4"/>
+              <w:left w:val="single" w:color="888888" w:sz="4"/>
+              <w:bottom w:val="single" w:color="888888" w:sz="4"/>
+              <w:right w:val="single" w:color="888888" w:sz="4"/>
+            </w:tcBorders>
+            <w:tcMar>
+              <w:top w:type="dxa" w:w="50"/>
+              <w:left w:type="dxa" w:w="80"/>
+              <w:bottom w:type="dxa" w:w="50"/>
+              <w:right w:type="dxa" w:w="80"/>
+            </w:tcMar>
+          </w:tcPr>
+          <w:p>
+            <w:r>
+              <w:rPr>
+                <w:rFonts w:ascii="Times New Roman" w:cs="Times New Roman" w:eastAsia="Times New Roman" w:hAnsi="Times New Roman"/>
+                <w:b w:val="false"/>
+                <w:bCs w:val="false"/>
+                <w:sz w:val="19"/>
+                <w:szCs w:val="19"/>
+              </w:rPr>
+              <w:t xml:space="preserve">Yelp</w:t>
+            </w:r>
+          </w:p>
+        </w:tc>
+        <w:tc>
+          <w:tcPr>
+            <w:tcW w:type="dxa" w:w="1500"/>
+            <w:tcBorders>
+              <w:top w:val="single" w:color="888888" w:sz="4"/>
+              <w:left w:val="single" w:color="888888" w:sz="4"/>
+              <w:bottom w:val="single" w:color="888888" w:sz="4"/>
+              <w:right w:val="single" w:color="888888" w:sz="4"/>
+            </w:tcBorders>
+            <w:tcMar>
+              <w:top w:type="dxa" w:w="50"/>
+              <w:left w:type="dxa" w:w="80"/>
+              <w:bottom w:type="dxa" w:w="50"/>
+              <w:right w:type="dxa" w:w="80"/>
+            </w:tcMar>
+          </w:tcPr>
+          <w:p>
+            <w:r>
+              <w:rPr>
+                <w:rFonts w:ascii="Times New Roman" w:cs="Times New Roman" w:eastAsia="Times New Roman" w:hAnsi="Times New Roman"/>
+                <w:b w:val="false"/>
+                <w:bCs w:val="false"/>
+                <w:sz w:val="19"/>
+                <w:szCs w:val="19"/>
+              </w:rPr>
+              <w:t xml:space="preserve">nltk</w:t>
+            </w:r>
+          </w:p>
+        </w:tc>
+        <w:tc>
+          <w:tcPr>
+            <w:tcW w:type="dxa" w:w="1500"/>
+            <w:tcBorders>
+              <w:top w:val="single" w:color="888888" w:sz="4"/>
+              <w:left w:val="single" w:color="888888" w:sz="4"/>
+              <w:bottom w:val="single" w:color="888888" w:sz="4"/>
+              <w:right w:val="single" w:color="888888" w:sz="4"/>
+            </w:tcBorders>
+            <w:tcMar>
+              <w:top w:type="dxa" w:w="50"/>
+              <w:left w:type="dxa" w:w="80"/>
+              <w:bottom w:type="dxa" w:w="50"/>
+              <w:right w:type="dxa" w:w="80"/>
+            </w:tcMar>
+          </w:tcPr>
+          <w:p>
+            <w:r>
+              <w:rPr>
+                <w:rFonts w:ascii="Times New Roman" w:cs="Times New Roman" w:eastAsia="Times New Roman" w:hAnsi="Times New Roman"/>
+                <w:b w:val="false"/>
+                <w:bCs w:val="false"/>
+                <w:sz w:val="19"/>
+                <w:szCs w:val="19"/>
+              </w:rPr>
+              <w:t xml:space="preserve">62.67</w:t>
+            </w:r>
+          </w:p>
+        </w:tc>
+        <w:tc>
+          <w:tcPr>
+            <w:tcW w:type="dxa" w:w="1500"/>
+            <w:tcBorders>
+              <w:top w:val="single" w:color="888888" w:sz="4"/>
+              <w:left w:val="single" w:color="888888" w:sz="4"/>
+              <w:bottom w:val="single" w:color="888888" w:sz="4"/>
+              <w:right w:val="single" w:color="888888" w:sz="4"/>
+            </w:tcBorders>
+            <w:tcMar>
+              <w:top w:type="dxa" w:w="50"/>
+              <w:left w:type="dxa" w:w="80"/>
+              <w:bottom w:type="dxa" w:w="50"/>
+              <w:right w:type="dxa" w:w="80"/>
+            </w:tcMar>
+          </w:tcPr>
+          <w:p>
+            <w:r>
+              <w:rPr>
+                <w:rFonts w:ascii="Times New Roman" w:cs="Times New Roman" w:eastAsia="Times New Roman" w:hAnsi="Times New Roman"/>
+                <w:b w:val="false"/>
+                <w:bCs w:val="false"/>
+                <w:sz w:val="19"/>
+                <w:szCs w:val="19"/>
+              </w:rPr>
+              <w:t xml:space="preserve">62.53</w:t>
+            </w:r>
+          </w:p>
+        </w:tc>
+        <w:tc>
+          <w:tcPr>
+            <w:tcW w:type="dxa" w:w="1500"/>
+            <w:tcBorders>
+              <w:top w:val="single" w:color="888888" w:sz="4"/>
+              <w:left w:val="single" w:color="888888" w:sz="4"/>
+              <w:bottom w:val="single" w:color="888888" w:sz="4"/>
+              <w:right w:val="single" w:color="888888" w:sz="4"/>
+            </w:tcBorders>
+            <w:tcMar>
+              <w:top w:type="dxa" w:w="50"/>
+              <w:left w:type="dxa" w:w="80"/>
+              <w:bottom w:type="dxa" w:w="50"/>
+              <w:right w:type="dxa" w:w="80"/>
+            </w:tcMar>
+          </w:tcPr>
+          <w:p>
+            <w:r>
+              <w:rPr>
+                <w:rFonts w:ascii="Times New Roman" w:cs="Times New Roman" w:eastAsia="Times New Roman" w:hAnsi="Times New Roman"/>
+                <w:b w:val="false"/>
+                <w:bCs w:val="false"/>
+                <w:sz w:val="19"/>
+                <w:szCs w:val="19"/>
+              </w:rPr>
+              <w:t xml:space="preserve">59.20</w:t>
+            </w:r>
+          </w:p>
+        </w:tc>
+        <w:tc>
+          <w:tcPr>
+            <w:tcW w:type="dxa" w:w="1500"/>
+            <w:tcBorders>
+              <w:top w:val="single" w:color="888888" w:sz="4"/>
+              <w:left w:val="single" w:color="888888" w:sz="4"/>
+              <w:bottom w:val="single" w:color="888888" w:sz="4"/>
+              <w:right w:val="single" w:color="888888" w:sz="4"/>
+            </w:tcBorders>
+            <w:tcMar>
+              <w:top w:type="dxa" w:w="50"/>
+              <w:left w:type="dxa" w:w="80"/>
+              <w:bottom w:type="dxa" w:w="50"/>
+              <w:right w:type="dxa" w:w="80"/>
+            </w:tcMar>
+          </w:tcPr>
+          <w:p>
+            <w:r>
+              <w:rPr>
+                <w:rFonts w:ascii="Times New Roman" w:cs="Times New Roman" w:eastAsia="Times New Roman" w:hAnsi="Times New Roman"/>
+                <w:b w:val="false"/>
+                <w:bCs w:val="false"/>
+                <w:sz w:val="19"/>
+                <w:szCs w:val="19"/>
+              </w:rPr>
+              <w:t xml:space="preserve">59.29</w:t>
+            </w:r>
+          </w:p>
+        </w:tc>
+      </w:tr>
+      <w:tr>
+        <w:trPr>
+          <w:cantSplit/>
+          <w:tblHeader w:val="false"/>
+        </w:trPr>
+        <w:tc>
+          <w:tcPr>
+            <w:tcW w:type="dxa" w:w="1900"/>
+            <w:tcBorders>
+              <w:top w:val="single" w:color="888888" w:sz="4"/>
+              <w:left w:val="single" w:color="888888" w:sz="4"/>
+              <w:bottom w:val="single" w:color="888888" w:sz="4"/>
+              <w:right w:val="single" w:color="888888" w:sz="4"/>
+            </w:tcBorders>
+            <w:tcMar>
+              <w:top w:type="dxa" w:w="50"/>
+              <w:left w:type="dxa" w:w="80"/>
+              <w:bottom w:type="dxa" w:w="50"/>
+              <w:right w:type="dxa" w:w="80"/>
+            </w:tcMar>
+          </w:tcPr>
+          <w:p>
+            <w:r>
+              <w:rPr>
+                <w:rFonts w:ascii="Times New Roman" w:cs="Times New Roman" w:eastAsia="Times New Roman" w:hAnsi="Times New Roman"/>
+                <w:b w:val="false"/>
+                <w:bCs w:val="false"/>
+                <w:sz w:val="19"/>
+                <w:szCs w:val="19"/>
+              </w:rPr>
+              <w:t xml:space="preserve">Yelp</w:t>
+            </w:r>
+          </w:p>
+        </w:tc>
+        <w:tc>
+          <w:tcPr>
+            <w:tcW w:type="dxa" w:w="1500"/>
+            <w:tcBorders>
+              <w:top w:val="single" w:color="888888" w:sz="4"/>
+              <w:left w:val="single" w:color="888888" w:sz="4"/>
+              <w:bottom w:val="single" w:color="888888" w:sz="4"/>
+              <w:right w:val="single" w:color="888888" w:sz="4"/>
+            </w:tcBorders>
+            <w:tcMar>
+              <w:top w:type="dxa" w:w="50"/>
+              <w:left w:type="dxa" w:w="80"/>
+              <w:bottom w:type="dxa" w:w="50"/>
+              <w:right w:type="dxa" w:w="80"/>
+            </w:tcMar>
+          </w:tcPr>
+          <w:p>
+            <w:r>
+              <w:rPr>
+                <w:rFonts w:ascii="Times New Roman" w:cs="Times New Roman" w:eastAsia="Times New Roman" w:hAnsi="Times New Roman"/>
+                <w:b w:val="false"/>
+                <w:bCs w:val="false"/>
+                <w:sz w:val="19"/>
+                <w:szCs w:val="19"/>
+              </w:rPr>
+              <w:t xml:space="preserve">tweet</w:t>
+            </w:r>
+          </w:p>
+        </w:tc>
+        <w:tc>
+          <w:tcPr>
+            <w:tcW w:type="dxa" w:w="1500"/>
+            <w:tcBorders>
+              <w:top w:val="single" w:color="888888" w:sz="4"/>
+              <w:left w:val="single" w:color="888888" w:sz="4"/>
+              <w:bottom w:val="single" w:color="888888" w:sz="4"/>
+              <w:right w:val="single" w:color="888888" w:sz="4"/>
+            </w:tcBorders>
+            <w:tcMar>
+              <w:top w:type="dxa" w:w="50"/>
+              <w:left w:type="dxa" w:w="80"/>
+              <w:bottom w:type="dxa" w:w="50"/>
+              <w:right w:type="dxa" w:w="80"/>
+            </w:tcMar>
+          </w:tcPr>
+          <w:p>
+            <w:r>
+              <w:rPr>
+                <w:rFonts w:ascii="Times New Roman" w:cs="Times New Roman" w:eastAsia="Times New Roman" w:hAnsi="Times New Roman"/>
+                <w:b w:val="false"/>
+                <w:bCs w:val="false"/>
+                <w:sz w:val="19"/>
+                <w:szCs w:val="19"/>
+              </w:rPr>
+              <w:t xml:space="preserve">62.89</w:t>
+            </w:r>
+          </w:p>
+        </w:tc>
+        <w:tc>
+          <w:tcPr>
+            <w:tcW w:type="dxa" w:w="1500"/>
+            <w:tcBorders>
+              <w:top w:val="single" w:color="888888" w:sz="4"/>
+              <w:left w:val="single" w:color="888888" w:sz="4"/>
+              <w:bottom w:val="single" w:color="888888" w:sz="4"/>
+              <w:right w:val="single" w:color="888888" w:sz="4"/>
+            </w:tcBorders>
+            <w:tcMar>
+              <w:top w:type="dxa" w:w="50"/>
+              <w:left w:type="dxa" w:w="80"/>
+              <w:bottom w:type="dxa" w:w="50"/>
+              <w:right w:type="dxa" w:w="80"/>
+            </w:tcMar>
+          </w:tcPr>
+          <w:p>
+            <w:r>
+              <w:rPr>
+                <w:rFonts w:ascii="Times New Roman" w:cs="Times New Roman" w:eastAsia="Times New Roman" w:hAnsi="Times New Roman"/>
+                <w:b w:val="false"/>
+                <w:bCs w:val="false"/>
+                <w:sz w:val="19"/>
+                <w:szCs w:val="19"/>
+              </w:rPr>
+              <w:t xml:space="preserve">62.76</w:t>
+            </w:r>
+          </w:p>
+        </w:tc>
+        <w:tc>
+          <w:tcPr>
+            <w:tcW w:type="dxa" w:w="1500"/>
+            <w:tcBorders>
+              <w:top w:val="single" w:color="888888" w:sz="4"/>
+              <w:left w:val="single" w:color="888888" w:sz="4"/>
+              <w:bottom w:val="single" w:color="888888" w:sz="4"/>
+              <w:right w:val="single" w:color="888888" w:sz="4"/>
+            </w:tcBorders>
+            <w:tcMar>
+              <w:top w:type="dxa" w:w="50"/>
+              <w:left w:type="dxa" w:w="80"/>
+              <w:bottom w:type="dxa" w:w="50"/>
+              <w:right w:type="dxa" w:w="80"/>
+            </w:tcMar>
+          </w:tcPr>
+          <w:p>
+            <w:r>
+              <w:rPr>
+                <w:rFonts w:ascii="Times New Roman" w:cs="Times New Roman" w:eastAsia="Times New Roman" w:hAnsi="Times New Roman"/>
+                <w:b w:val="false"/>
+                <w:bCs w:val="false"/>
+                <w:sz w:val="19"/>
+                <w:szCs w:val="19"/>
+              </w:rPr>
+              <w:t xml:space="preserve">59.42</w:t>
+            </w:r>
+          </w:p>
+        </w:tc>
+        <w:tc>
+          <w:tcPr>
+            <w:tcW w:type="dxa" w:w="1500"/>
+            <w:tcBorders>
+              <w:top w:val="single" w:color="888888" w:sz="4"/>
+              <w:left w:val="single" w:color="888888" w:sz="4"/>
+              <w:bottom w:val="single" w:color="888888" w:sz="4"/>
+              <w:right w:val="single" w:color="888888" w:sz="4"/>
+            </w:tcBorders>
+            <w:tcMar>
+              <w:top w:type="dxa" w:w="50"/>
+              <w:left w:type="dxa" w:w="80"/>
+              <w:bottom w:type="dxa" w:w="50"/>
+              <w:right w:type="dxa" w:w="80"/>
+            </w:tcMar>
+          </w:tcPr>
+          <w:p>
+            <w:r>
+              <w:rPr>
+                <w:rFonts w:ascii="Times New Roman" w:cs="Times New Roman" w:eastAsia="Times New Roman" w:hAnsi="Times New Roman"/>
+                <w:b w:val="false"/>
+                <w:bCs w:val="false"/>
+                <w:sz w:val="19"/>
+                <w:szCs w:val="19"/>
+              </w:rPr>
+              <w:t xml:space="preserve">59.51</w:t>
+            </w:r>
+          </w:p>
+        </w:tc>
+      </w:tr>
+      <w:tr>
+        <w:trPr>
+          <w:cantSplit/>
+          <w:tblHeader w:val="false"/>
+        </w:trPr>
+        <w:tc>
+          <w:tcPr>
+            <w:tcW w:type="dxa" w:w="1900"/>
+            <w:tcBorders>
+              <w:top w:val="single" w:color="888888" w:sz="4"/>
+              <w:left w:val="single" w:color="888888" w:sz="4"/>
+              <w:bottom w:val="single" w:color="888888" w:sz="4"/>
+              <w:right w:val="single" w:color="888888" w:sz="4"/>
+            </w:tcBorders>
+            <w:tcMar>
+              <w:top w:type="dxa" w:w="50"/>
+              <w:left w:type="dxa" w:w="80"/>
+              <w:bottom w:type="dxa" w:w="50"/>
+              <w:right w:type="dxa" w:w="80"/>
+            </w:tcMar>
+          </w:tcPr>
+          <w:p>
+            <w:r>
+              <w:rPr>
+                <w:rFonts w:ascii="Times New Roman" w:cs="Times New Roman" w:eastAsia="Times New Roman" w:hAnsi="Times New Roman"/>
+                <w:b w:val="false"/>
+                <w:bCs w:val="false"/>
+                <w:sz w:val="19"/>
+                <w:szCs w:val="19"/>
+              </w:rPr>
+              <w:t xml:space="preserve">Yelp</w:t>
+            </w:r>
+          </w:p>
+        </w:tc>
+        <w:tc>
+          <w:tcPr>
+            <w:tcW w:type="dxa" w:w="1500"/>
+            <w:tcBorders>
+              <w:top w:val="single" w:color="888888" w:sz="4"/>
+              <w:left w:val="single" w:color="888888" w:sz="4"/>
+              <w:bottom w:val="single" w:color="888888" w:sz="4"/>
+              <w:right w:val="single" w:color="888888" w:sz="4"/>
+            </w:tcBorders>
+            <w:tcMar>
+              <w:top w:type="dxa" w:w="50"/>
+              <w:left w:type="dxa" w:w="80"/>
+              <w:bottom w:type="dxa" w:w="50"/>
+              <w:right w:type="dxa" w:w="80"/>
+            </w:tcMar>
+          </w:tcPr>
+          <w:p>
+            <w:r>
+              <w:rPr>
+                <w:rFonts w:ascii="Times New Roman" w:cs="Times New Roman" w:eastAsia="Times New Roman" w:hAnsi="Times New Roman"/>
+                <w:b w:val="false"/>
+                <w:bCs w:val="false"/>
+                <w:sz w:val="19"/>
+                <w:szCs w:val="19"/>
+              </w:rPr>
+              <w:t xml:space="preserve">lexfront</w:t>
+            </w:r>
+          </w:p>
+        </w:tc>
+        <w:tc>
+          <w:tcPr>
+            <w:tcW w:type="dxa" w:w="1500"/>
+            <w:tcBorders>
+              <w:top w:val="single" w:color="888888" w:sz="4"/>
+              <w:left w:val="single" w:color="888888" w:sz="4"/>
+              <w:bottom w:val="single" w:color="888888" w:sz="4"/>
+              <w:right w:val="single" w:color="888888" w:sz="4"/>
+            </w:tcBorders>
+            <w:tcMar>
+              <w:top w:type="dxa" w:w="50"/>
+              <w:left w:type="dxa" w:w="80"/>
+              <w:bottom w:type="dxa" w:w="50"/>
+              <w:right w:type="dxa" w:w="80"/>
+            </w:tcMar>
+          </w:tcPr>
+          <w:p>
+            <w:r>
+              <w:rPr>
+                <w:rFonts w:ascii="Times New Roman" w:cs="Times New Roman" w:eastAsia="Times New Roman" w:hAnsi="Times New Roman"/>
+                <w:b w:val="false"/>
+                <w:bCs w:val="false"/>
+                <w:sz w:val="19"/>
+                <w:szCs w:val="19"/>
+              </w:rPr>
+              <w:t xml:space="preserve">62.75</w:t>
+            </w:r>
+          </w:p>
+        </w:tc>
+        <w:tc>
+          <w:tcPr>
+            <w:tcW w:type="dxa" w:w="1500"/>
+            <w:tcBorders>
+              <w:top w:val="single" w:color="888888" w:sz="4"/>
+              <w:left w:val="single" w:color="888888" w:sz="4"/>
+              <w:bottom w:val="single" w:color="888888" w:sz="4"/>
+              <w:right w:val="single" w:color="888888" w:sz="4"/>
+            </w:tcBorders>
+            <w:tcMar>
+              <w:top w:type="dxa" w:w="50"/>
+              <w:left w:type="dxa" w:w="80"/>
+              <w:bottom w:type="dxa" w:w="50"/>
+              <w:right w:type="dxa" w:w="80"/>
+            </w:tcMar>
+          </w:tcPr>
+          <w:p>
+            <w:r>
+              <w:rPr>
+                <w:rFonts w:ascii="Times New Roman" w:cs="Times New Roman" w:eastAsia="Times New Roman" w:hAnsi="Times New Roman"/>
+                <w:b w:val="false"/>
+                <w:bCs w:val="false"/>
+                <w:sz w:val="19"/>
+                <w:szCs w:val="19"/>
+              </w:rPr>
+              <w:t xml:space="preserve">62.60</w:t>
+            </w:r>
+          </w:p>
+        </w:tc>
+        <w:tc>
+          <w:tcPr>
+            <w:tcW w:type="dxa" w:w="1500"/>
+            <w:tcBorders>
+              <w:top w:val="single" w:color="888888" w:sz="4"/>
+              <w:left w:val="single" w:color="888888" w:sz="4"/>
+              <w:bottom w:val="single" w:color="888888" w:sz="4"/>
+              <w:right w:val="single" w:color="888888" w:sz="4"/>
+            </w:tcBorders>
+            <w:tcMar>
+              <w:top w:type="dxa" w:w="50"/>
+              <w:left w:type="dxa" w:w="80"/>
+              <w:bottom w:type="dxa" w:w="50"/>
+              <w:right w:type="dxa" w:w="80"/>
+            </w:tcMar>
+          </w:tcPr>
+          <w:p>
+            <w:r>
+              <w:rPr>
+                <w:rFonts w:ascii="Times New Roman" w:cs="Times New Roman" w:eastAsia="Times New Roman" w:hAnsi="Times New Roman"/>
+                <w:b w:val="false"/>
+                <w:bCs w:val="false"/>
+                <w:sz w:val="19"/>
+                <w:szCs w:val="19"/>
+              </w:rPr>
+              <w:t xml:space="preserve">59.11</w:t>
+            </w:r>
+          </w:p>
+        </w:tc>
+        <w:tc>
+          <w:tcPr>
+            <w:tcW w:type="dxa" w:w="1500"/>
+            <w:tcBorders>
+              <w:top w:val="single" w:color="888888" w:sz="4"/>
+              <w:left w:val="single" w:color="888888" w:sz="4"/>
+              <w:bottom w:val="single" w:color="888888" w:sz="4"/>
+              <w:right w:val="single" w:color="888888" w:sz="4"/>
+            </w:tcBorders>
+            <w:tcMar>
+              <w:top w:type="dxa" w:w="50"/>
+              <w:left w:type="dxa" w:w="80"/>
+              <w:bottom w:type="dxa" w:w="50"/>
+              <w:right w:type="dxa" w:w="80"/>
+            </w:tcMar>
+          </w:tcPr>
+          <w:p>
+            <w:r>
+              <w:rPr>
+                <w:rFonts w:ascii="Times New Roman" w:cs="Times New Roman" w:eastAsia="Times New Roman" w:hAnsi="Times New Roman"/>
+                <w:b w:val="false"/>
+                <w:bCs w:val="false"/>
+                <w:sz w:val="19"/>
+                <w:szCs w:val="19"/>
+              </w:rPr>
+              <w:t xml:space="preserve">59.21</w:t>
+            </w:r>
+          </w:p>
+        </w:tc>
+      </w:tr>
     </w:tbl>
     <w:p>
       <w:pPr>
@@ -17133,7 +18047,7 @@
           <w:sz w:val="24"/>
           <w:szCs w:val="24"/>
         </w:rPr>
-        <w:t xml:space="preserve">A caution on how these two runs were made. They ran on a Windows laptop with Python 3.12, while the Sentiment140 runs ran on Colab. Each run records its own library versions, so the results are valid but should not be mixed at the digit level. We also tried the Yelp reviews dataset (five star classes) with the same protocol. At the time of writing that run had not finished, so we report no Yelp result.</w:t>
+        <w:t xml:space="preserve">A caution on how these three runs were made. They ran on a Windows laptop with Python 3.12, while the Sentiment140 runs ran on Colab. Each run records its own library versions, so the results are valid but should not be mixed at the digit level. The Yelp run needed about 10 hours of fitting time in total, and an earlier attempt on Colab did not finish.</w:t>
       </w:r>
     </w:p>
     <w:p>
@@ -18485,7 +19399,7 @@
           <w:sz w:val="24"/>
           <w:szCs w:val="24"/>
         </w:rPr>
-        <w:t xml:space="preserve">Figure 7 puts the tokenizer-only comparison for Logistic Regression on all eleven datasets in one place. The tuned or wide-tuned setting is used, so that the comparison is not tied to default settings. The picture is clear. Nine of the eleven point estimates lie inside the margin. The two exceptions are tweet_eval hate (-0.66) and irony (+3.06), and both have wide intervals that include values inside the margin. The three large datasets have narrow intervals, and they are tight around zero: +0.11 on Sentiment140, 0.00 on Civil Comments and +0.46 on Amazon polarity. The small datasets have wide intervals, because their test sets are small, so they cannot rule out a difference of a point or more in either direction. The only point far from zero, tweet_eval irony, has the widest interval and rests on 784 test examples. There is no dataset where LexFront is clearly better than NLTK by more than the margin, and none where it is clearly worse once the classifier is tuned. We read this as "competitive", not "better".</w:t>
+        <w:t xml:space="preserve">Figure 7 puts the tokenizer-only comparison for Logistic Regression on all twelve datasets in one place. The tuned or wide-tuned setting is used, so that the comparison is not tied to default settings. The picture is clear. Ten of the twelve point estimates lie inside the margin. The two exceptions are tweet_eval hate (-0.66) and irony (+3.06), and both have wide intervals that include values inside the margin. The four large datasets have much narrower intervals, and they are tight around zero: +0.11 on Sentiment140, 0.00 on Civil Comments, +0.46 on Amazon polarity and +0.07 on Yelp. The small datasets have wide intervals, because their test sets are small, so they cannot rule out a difference of a point or more in either direction. The only point far from zero, tweet_eval irony, has the widest interval and rests on 784 test examples. There is no dataset where LexFront is clearly better than NLTK by more than the margin, and none where it is clearly worse once the classifier is tuned. We read this as "competitive", not "better".</w:t>
       </w:r>
     </w:p>
     <w:p>
@@ -18894,7 +19808,7 @@
                 <w:sz w:val="18"/>
                 <w:szCs w:val="18"/>
               </w:rPr>
-              <w:t xml:space="preserve">-1.01 to +10.26 (mean over tokenizers, collection); +5.7 to +6.7 on Amazon</w:t>
+              <w:t xml:space="preserve">-1.01 to +10.26 (mean over tokenizers, collection); +5.4 to +6.7 on Amazon and Yelp</w:t>
             </w:r>
           </w:p>
         </w:tc>
@@ -18987,7 +19901,7 @@
                 <w:sz w:val="18"/>
                 <w:szCs w:val="18"/>
               </w:rPr>
-              <w:t xml:space="preserve">-0.77 to +1.41 (collection); +2.0 to +3.0 (Sentiment140); +2.8 to +3.3 (Amazon)</w:t>
+              <w:t xml:space="preserve">-0.77 to +1.41 (collection); +2.0 to +3.0 (Sentiment140); +2.8 to +3.3 (Amazon); +2.6 to +3.2 (Yelp)</w:t>
             </w:r>
           </w:p>
         </w:tc>
@@ -19080,7 +19994,7 @@
                 <w:sz w:val="18"/>
                 <w:szCs w:val="18"/>
               </w:rPr>
-              <w:t xml:space="preserve">0.00 to +0.46 on the three large datasets; -0.66 to +3.06 (wide intervals) on the small ones</w:t>
+              <w:t xml:space="preserve">0.00 to +0.46 on the four large datasets; -0.66 to +3.06 (wide intervals) on the small ones</w:t>
             </w:r>
           </w:p>
         </w:tc>
@@ -20396,6 +21310,99 @@
           </w:p>
         </w:tc>
       </w:tr>
+      <w:tr>
+        <w:trPr>
+          <w:cantSplit/>
+          <w:tblHeader w:val="false"/>
+        </w:trPr>
+        <w:tc>
+          <w:tcPr>
+            <w:tcW w:type="dxa" w:w="2200"/>
+            <w:tcBorders>
+              <w:top w:val="single" w:color="888888" w:sz="4"/>
+              <w:left w:val="single" w:color="888888" w:sz="4"/>
+              <w:bottom w:val="single" w:color="888888" w:sz="4"/>
+              <w:right w:val="single" w:color="888888" w:sz="4"/>
+            </w:tcBorders>
+            <w:tcMar>
+              <w:top w:type="dxa" w:w="50"/>
+              <w:left w:type="dxa" w:w="80"/>
+              <w:bottom w:type="dxa" w:w="50"/>
+              <w:right w:type="dxa" w:w="80"/>
+            </w:tcMar>
+          </w:tcPr>
+          <w:p>
+            <w:r>
+              <w:rPr>
+                <w:rFonts w:ascii="Times New Roman" w:cs="Times New Roman" w:eastAsia="Times New Roman" w:hAnsi="Times New Roman"/>
+                <w:b w:val="false"/>
+                <w:bCs w:val="false"/>
+                <w:sz w:val="18"/>
+                <w:szCs w:val="18"/>
+              </w:rPr>
+              <w:t xml:space="preserve">HA2 / HA3 (Yelp)</w:t>
+            </w:r>
+          </w:p>
+        </w:tc>
+        <w:tc>
+          <w:tcPr>
+            <w:tcW w:type="dxa" w:w="4700"/>
+            <w:tcBorders>
+              <w:top w:val="single" w:color="888888" w:sz="4"/>
+              <w:left w:val="single" w:color="888888" w:sz="4"/>
+              <w:bottom w:val="single" w:color="888888" w:sz="4"/>
+              <w:right w:val="single" w:color="888888" w:sz="4"/>
+            </w:tcBorders>
+            <w:tcMar>
+              <w:top w:type="dxa" w:w="50"/>
+              <w:left w:type="dxa" w:w="80"/>
+              <w:bottom w:type="dxa" w:w="50"/>
+              <w:right w:type="dxa" w:w="80"/>
+            </w:tcMar>
+          </w:tcPr>
+          <w:p>
+            <w:r>
+              <w:rPr>
+                <w:rFonts w:ascii="Times New Roman" w:cs="Times New Roman" w:eastAsia="Times New Roman" w:hAnsi="Times New Roman"/>
+                <w:b w:val="false"/>
+                <w:bCs w:val="false"/>
+                <w:sz w:val="18"/>
+                <w:szCs w:val="18"/>
+              </w:rPr>
+              <w:t xml:space="preserve">As above</w:t>
+            </w:r>
+          </w:p>
+        </w:tc>
+        <w:tc>
+          <w:tcPr>
+            <w:tcW w:type="dxa" w:w="2600"/>
+            <w:tcBorders>
+              <w:top w:val="single" w:color="888888" w:sz="4"/>
+              <w:left w:val="single" w:color="888888" w:sz="4"/>
+              <w:bottom w:val="single" w:color="888888" w:sz="4"/>
+              <w:right w:val="single" w:color="888888" w:sz="4"/>
+            </w:tcBorders>
+            <w:tcMar>
+              <w:top w:type="dxa" w:w="50"/>
+              <w:left w:type="dxa" w:w="80"/>
+              <w:bottom w:type="dxa" w:w="50"/>
+              <w:right w:type="dxa" w:w="80"/>
+            </w:tcMar>
+          </w:tcPr>
+          <w:p>
+            <w:r>
+              <w:rPr>
+                <w:rFonts w:ascii="Times New Roman" w:cs="Times New Roman" w:eastAsia="Times New Roman" w:hAnsi="Times New Roman"/>
+                <w:b w:val="false"/>
+                <w:bCs w:val="false"/>
+                <w:sz w:val="18"/>
+                <w:szCs w:val="18"/>
+              </w:rPr>
+              <w:t xml:space="preserve">HA2 observed, HA3 not observed (1.22 against 0.98)</w:t>
+            </w:r>
+          </w:p>
+        </w:tc>
+      </w:tr>
     </w:tbl>
     <w:p>
       <w:pPr>
@@ -20429,7 +21436,7 @@
           <w:sz w:val="24"/>
           <w:szCs w:val="24"/>
         </w:rPr>
-        <w:t xml:space="preserve">A few cautions apply to all of the numbers. There is one training run per cell, so training randomness is not covered by the intervals, which only measure test-set sampling. We ran many comparisons and did not correct for multiple testing. In the rule ablation, 6 of 42 interval comparisons exclude 0 when about 2 would be expected by chance. All datasets are English, and the large ones are two-class, so we cannot say anything about other languages, code-mixed text or many-class problems at scale. We did not test transformer models. The Yelp run did not finish, so it is not reported. The Colab and laptop runs used different library versions, which each run records. All reasons we give for why a difference appears are hypotheses, not tested conclusions.</w:t>
+        <w:t xml:space="preserve">A few cautions apply to all of the numbers. There is one training run per cell, so training randomness is not covered by the intervals, which only measure test-set sampling. We ran many comparisons and did not correct for multiple testing. In the rule ablation, 6 of 42 interval comparisons exclude 0 when about 2 would be expected by chance. All datasets are English, and all large ones except Yelp are two-class, so we cannot say anything about other languages or code-mixed text, and Yelp is our only many-class test at scale. We did not test transformer models. The Colab and laptop runs used different library versions, which each run records. All reasons we give for why a difference appears are hypotheses, not tested conclusions.</w:t>
       </w:r>
     </w:p>
     <w:p>
@@ -20473,7 +21480,7 @@
           <w:sz w:val="24"/>
           <w:szCs w:val="24"/>
         </w:rPr>
-        <w:t xml:space="preserve">On the question we started with, the answer is that a compiler-style lexer is competitive but not better. This held on the three core datasets, on the eight-dataset collection with fair tuning, and on three large datasets with around half a million to one and a half million training examples. With the tokenizer as the only change, LexFront stays within about half a point of NLTK and TweetTokenizer on the large datasets, and its clear advantage is over plain whitespace splitting, especially in macro-F1 on Civil Comments. It gives a smaller vocabulary, a lower out-of-vocabulary rate and slightly smaller accuracy losses under added noise. Most of the accuracy comes from the classifier and its tuning. BPE, WordPiece, Unigram and the character n-gram baseline did not improve on the word-level tokenizers, and several of our own hypotheses were not supported, which we report as they came out.</w:t>
+        <w:t xml:space="preserve">On the question we started with, the answer is that a compiler-style lexer is competitive but not better. This held on the three core datasets, on the eight-dataset collection with fair tuning, and on four large datasets with about 300,000 to 1.5 million training examples, one of them with five classes. With the tokenizer as the only change, LexFront stays within about half a point of NLTK and TweetTokenizer on the large datasets, and its clear advantage is over plain whitespace splitting, especially in macro-F1 on Civil Comments and by about one point on Yelp. It gives a smaller vocabulary, a lower out-of-vocabulary rate and slightly smaller accuracy losses under added noise. Most of the accuracy comes from the classifier and its tuning. BPE, WordPiece, Unigram and the character n-gram baseline did not improve on the word-level tokenizers, and several of our own hypotheses were not supported, which we report as they came out.</w:t>
       </w:r>
     </w:p>
     <w:p>

</xml_diff>

<commit_message>
Final report: add team details, subject, faculty, school and university to the title block
Co-Authored-By: Claude Sonnet 5.5 <noreply@anthropic.com>
Claude-Session: https://claude.ai/code/session_01Q1RoAMr7AGRCD4cuNgQnXj
</commit_message>
<xml_diff>
--- a/report/LexFront_Final_Report.docx
+++ b/report/LexFront_Final_Report.docx
@@ -34,7 +34,7 @@
     </w:p>
     <w:p>
       <w:pPr>
-        <w:spacing w:after="360"/>
+        <w:spacing w:after="160"/>
         <w:jc w:val="center"/>
       </w:pPr>
       <w:r>
@@ -47,6 +47,203 @@
         </w:rPr>
         <w:t xml:space="preserve">Compiler Design Project, Final Report</w:t>
       </w:r>
+    </w:p>
+    <w:p>
+      <w:pPr>
+        <w:spacing w:after="60" w:before="60"/>
+        <w:jc w:val="center"/>
+      </w:pPr>
+      <w:r>
+        <w:rPr>
+          <w:rFonts w:ascii="Times New Roman" w:cs="Times New Roman" w:eastAsia="Times New Roman" w:hAnsi="Times New Roman"/>
+          <w:b/>
+          <w:bCs/>
+          <w:sz w:val="22"/>
+          <w:szCs w:val="22"/>
+        </w:rPr>
+        <w:t xml:space="preserve">Team members</w:t>
+      </w:r>
+    </w:p>
+    <w:p>
+      <w:pPr>
+        <w:spacing w:after="40"/>
+        <w:jc w:val="center"/>
+      </w:pPr>
+      <w:r>
+        <w:rPr>
+          <w:rFonts w:ascii="Times New Roman" w:cs="Times New Roman" w:eastAsia="Times New Roman" w:hAnsi="Times New Roman"/>
+          <w:b/>
+          <w:bCs/>
+          <w:sz w:val="22"/>
+          <w:szCs w:val="22"/>
+        </w:rPr>
+        <w:t xml:space="preserve"/>
+      </w:r>
+      <w:r>
+        <w:rPr>
+          <w:rFonts w:ascii="Times New Roman" w:cs="Times New Roman" w:eastAsia="Times New Roman" w:hAnsi="Times New Roman"/>
+          <w:sz w:val="22"/>
+          <w:szCs w:val="22"/>
+        </w:rPr>
+        <w:t xml:space="preserve">Veer Jahaan Arora (24BCB0080)</w:t>
+      </w:r>
+    </w:p>
+    <w:p>
+      <w:pPr>
+        <w:spacing w:after="40"/>
+        <w:jc w:val="center"/>
+      </w:pPr>
+      <w:r>
+        <w:rPr>
+          <w:rFonts w:ascii="Times New Roman" w:cs="Times New Roman" w:eastAsia="Times New Roman" w:hAnsi="Times New Roman"/>
+          <w:b/>
+          <w:bCs/>
+          <w:sz w:val="22"/>
+          <w:szCs w:val="22"/>
+        </w:rPr>
+        <w:t xml:space="preserve"/>
+      </w:r>
+      <w:r>
+        <w:rPr>
+          <w:rFonts w:ascii="Times New Roman" w:cs="Times New Roman" w:eastAsia="Times New Roman" w:hAnsi="Times New Roman"/>
+          <w:sz w:val="22"/>
+          <w:szCs w:val="22"/>
+        </w:rPr>
+        <w:t xml:space="preserve">Yash Aggarwal (24BKT0013)</w:t>
+      </w:r>
+    </w:p>
+    <w:p>
+      <w:pPr>
+        <w:spacing w:after="40"/>
+        <w:jc w:val="center"/>
+      </w:pPr>
+      <w:r>
+        <w:rPr>
+          <w:rFonts w:ascii="Times New Roman" w:cs="Times New Roman" w:eastAsia="Times New Roman" w:hAnsi="Times New Roman"/>
+          <w:b/>
+          <w:bCs/>
+          <w:sz w:val="22"/>
+          <w:szCs w:val="22"/>
+        </w:rPr>
+        <w:t xml:space="preserve"/>
+      </w:r>
+      <w:r>
+        <w:rPr>
+          <w:rFonts w:ascii="Times New Roman" w:cs="Times New Roman" w:eastAsia="Times New Roman" w:hAnsi="Times New Roman"/>
+          <w:sz w:val="22"/>
+          <w:szCs w:val="22"/>
+        </w:rPr>
+        <w:t xml:space="preserve">V C Pavitran (24BCE2019)</w:t>
+      </w:r>
+    </w:p>
+    <w:p>
+      <w:pPr>
+        <w:spacing w:after="60"/>
+      </w:pPr>
+    </w:p>
+    <w:p>
+      <w:pPr>
+        <w:spacing w:after="40"/>
+        <w:jc w:val="center"/>
+      </w:pPr>
+      <w:r>
+        <w:rPr>
+          <w:rFonts w:ascii="Times New Roman" w:cs="Times New Roman" w:eastAsia="Times New Roman" w:hAnsi="Times New Roman"/>
+          <w:b/>
+          <w:bCs/>
+          <w:sz w:val="22"/>
+          <w:szCs w:val="22"/>
+        </w:rPr>
+        <w:t xml:space="preserve">Subject: </w:t>
+      </w:r>
+      <w:r>
+        <w:rPr>
+          <w:rFonts w:ascii="Times New Roman" w:cs="Times New Roman" w:eastAsia="Times New Roman" w:hAnsi="Times New Roman"/>
+          <w:sz w:val="22"/>
+          <w:szCs w:val="22"/>
+        </w:rPr>
+        <w:t xml:space="preserve">Compiler Design Lab (BCSE307P)</w:t>
+      </w:r>
+    </w:p>
+    <w:p>
+      <w:pPr>
+        <w:spacing w:after="40"/>
+        <w:jc w:val="center"/>
+      </w:pPr>
+      <w:r>
+        <w:rPr>
+          <w:rFonts w:ascii="Times New Roman" w:cs="Times New Roman" w:eastAsia="Times New Roman" w:hAnsi="Times New Roman"/>
+          <w:b/>
+          <w:bCs/>
+          <w:sz w:val="22"/>
+          <w:szCs w:val="22"/>
+        </w:rPr>
+        <w:t xml:space="preserve">Faculty: </w:t>
+      </w:r>
+      <w:r>
+        <w:rPr>
+          <w:rFonts w:ascii="Times New Roman" w:cs="Times New Roman" w:eastAsia="Times New Roman" w:hAnsi="Times New Roman"/>
+          <w:sz w:val="22"/>
+          <w:szCs w:val="22"/>
+        </w:rPr>
+        <w:t xml:space="preserve">Suganthini C</w:t>
+      </w:r>
+    </w:p>
+    <w:p>
+      <w:pPr>
+        <w:spacing w:after="40"/>
+        <w:jc w:val="center"/>
+      </w:pPr>
+      <w:r>
+        <w:rPr>
+          <w:rFonts w:ascii="Times New Roman" w:cs="Times New Roman" w:eastAsia="Times New Roman" w:hAnsi="Times New Roman"/>
+          <w:b/>
+          <w:bCs/>
+          <w:sz w:val="22"/>
+          <w:szCs w:val="22"/>
+        </w:rPr>
+        <w:t xml:space="preserve">School: </w:t>
+      </w:r>
+      <w:r>
+        <w:rPr>
+          <w:rFonts w:ascii="Times New Roman" w:cs="Times New Roman" w:eastAsia="Times New Roman" w:hAnsi="Times New Roman"/>
+          <w:sz w:val="22"/>
+          <w:szCs w:val="22"/>
+        </w:rPr>
+        <w:t xml:space="preserve">School of Computer Science and Engineering (SCOPE)</w:t>
+      </w:r>
+    </w:p>
+    <w:p>
+      <w:pPr>
+        <w:spacing w:after="40"/>
+        <w:jc w:val="center"/>
+      </w:pPr>
+      <w:r>
+        <w:rPr>
+          <w:rFonts w:ascii="Times New Roman" w:cs="Times New Roman" w:eastAsia="Times New Roman" w:hAnsi="Times New Roman"/>
+          <w:b/>
+          <w:bCs/>
+          <w:sz w:val="22"/>
+          <w:szCs w:val="22"/>
+        </w:rPr>
+        <w:t xml:space="preserve">University: </w:t>
+      </w:r>
+      <w:r>
+        <w:rPr>
+          <w:rFonts w:ascii="Times New Roman" w:cs="Times New Roman" w:eastAsia="Times New Roman" w:hAnsi="Times New Roman"/>
+          <w:sz w:val="22"/>
+          <w:szCs w:val="22"/>
+        </w:rPr>
+        <w:t xml:space="preserve">Vellore Institute of Technology (VIT), Vellore</w:t>
+      </w:r>
+    </w:p>
+    <w:p>
+      <w:pPr>
+        <w:pBdr>
+          <w:bottom w:val="single" w:color="888888" w:sz="6" w:space="1"/>
+        </w:pBdr>
+        <w:spacing w:after="200"/>
+      </w:pPr>
     </w:p>
     <w:p>
       <w:pPr>

</xml_diff>

<commit_message>
Sharper figures: redraw result charts at 300 dpi with larger text and use them in the reports
Co-Authored-By: Claude Sonnet 5.5 <noreply@anthropic.com>
Claude-Session: https://claude.ai/code/session_01Q1RoAMr7AGRCD4cuNgQnXj
</commit_message>
<xml_diff>
--- a/report/LexFront_Final_Report.docx
+++ b/report/LexFront_Final_Report.docx
@@ -736,7 +736,7 @@
       <w:r>
         <w:drawing>
           <wp:inline distT="0" distB="0" distL="0" distR="0">
-            <wp:extent cx="5334000" cy="3038475"/>
+            <wp:extent cx="5334000" cy="3086100"/>
             <wp:effectExtent t="0" r="0" b="0" l="0"/>
             <wp:docPr id="1" name="/home/user/lexfront-dfa-tokenizer/report/figures/architecture.png" descr="/home/user/lexfront-dfa-tokenizer/report/figures/architecture.png" title="/home/user/lexfront-dfa-tokenizer/report/figures/architecture.png"/>
             <wp:cNvGraphicFramePr>
@@ -761,7 +761,7 @@
                   <pic:spPr bwMode="auto">
                     <a:xfrm>
                       <a:off x="0" y="0"/>
-                      <a:ext cx="5334000" cy="3038475"/>
+                      <a:ext cx="5334000" cy="3086100"/>
                     </a:xfrm>
                     <a:prstGeom prst="rect">
                       <a:avLst/>
@@ -6728,9 +6728,9 @@
       <w:r>
         <w:drawing>
           <wp:inline distT="0" distB="0" distL="0" distR="0">
-            <wp:extent cx="4953000" cy="1800225"/>
+            <wp:extent cx="5715000" cy="2076450"/>
             <wp:effectExtent t="0" r="0" b="0" l="0"/>
-            <wp:docPr id="1" name="/home/user/lexfront-dfa-tokenizer/results/figures/module1_accuracy.png" descr="/home/user/lexfront-dfa-tokenizer/results/figures/module1_accuracy.png" title="/home/user/lexfront-dfa-tokenizer/results/figures/module1_accuracy.png"/>
+            <wp:docPr id="1" name="/home/user/lexfront-dfa-tokenizer/report/figures/hq_module1_accuracy.png" descr="/home/user/lexfront-dfa-tokenizer/report/figures/hq_module1_accuracy.png" title="/home/user/lexfront-dfa-tokenizer/report/figures/hq_module1_accuracy.png"/>
             <wp:cNvGraphicFramePr>
               <a:graphicFrameLocks xmlns:a="http://schemas.openxmlformats.org/drawingml/2006/main" noChangeAspect="1"/>
             </wp:cNvGraphicFramePr>
@@ -6753,7 +6753,7 @@
                   <pic:spPr bwMode="auto">
                     <a:xfrm>
                       <a:off x="0" y="0"/>
-                      <a:ext cx="4953000" cy="1800225"/>
+                      <a:ext cx="5715000" cy="2076450"/>
                     </a:xfrm>
                     <a:prstGeom prst="rect">
                       <a:avLst/>
@@ -6780,7 +6780,7 @@
           <w:sz w:val="20"/>
           <w:szCs w:val="20"/>
         </w:rPr>
-        <w:t xml:space="preserve">Figure 2. Accuracy of the existing tokenizers (results/figures/module1_accuracy.png)</w:t>
+        <w:t xml:space="preserve">Figure 2. Accuracy of the existing tokenizers (redrawn at 300 dpi from results/module1)</w:t>
       </w:r>
     </w:p>
     <w:p>
@@ -8085,7 +8085,7 @@
       <w:r>
         <w:drawing>
           <wp:inline distT="0" distB="0" distL="0" distR="0">
-            <wp:extent cx="3810000" cy="2371725"/>
+            <wp:extent cx="4191000" cy="2609850"/>
             <wp:effectExtent t="0" r="0" b="0" l="0"/>
             <wp:docPr id="1" name="/home/user/lexfront-dfa-tokenizer/results/module2/dfa_min.png" descr="/home/user/lexfront-dfa-tokenizer/results/module2/dfa_min.png" title="/home/user/lexfront-dfa-tokenizer/results/module2/dfa_min.png"/>
             <wp:cNvGraphicFramePr>
@@ -8110,7 +8110,7 @@
                   <pic:spPr bwMode="auto">
                     <a:xfrm>
                       <a:off x="0" y="0"/>
-                      <a:ext cx="3810000" cy="2371725"/>
+                      <a:ext cx="4191000" cy="2609850"/>
                     </a:xfrm>
                     <a:prstGeom prst="rect">
                       <a:avLst/>
@@ -12390,7 +12390,7 @@
       <w:r>
         <w:drawing>
           <wp:inline distT="0" distB="0" distL="0" distR="0">
-            <wp:extent cx="5334000" cy="1685925"/>
+            <wp:extent cx="5715000" cy="2162175"/>
             <wp:effectExtent t="0" r="0" b="0" l="0"/>
             <wp:docPr id="1" name="/home/user/lexfront-dfa-tokenizer/report/figures/ablation.png" descr="/home/user/lexfront-dfa-tokenizer/report/figures/ablation.png" title="/home/user/lexfront-dfa-tokenizer/report/figures/ablation.png"/>
             <wp:cNvGraphicFramePr>
@@ -12415,7 +12415,7 @@
                   <pic:spPr bwMode="auto">
                     <a:xfrm>
                       <a:off x="0" y="0"/>
-                      <a:ext cx="5334000" cy="1685925"/>
+                      <a:ext cx="5715000" cy="2162175"/>
                     </a:xfrm>
                     <a:prstGeom prst="rect">
                       <a:avLst/>
@@ -13961,7 +13961,7 @@
       <w:r>
         <w:drawing>
           <wp:inline distT="0" distB="0" distL="0" distR="0">
-            <wp:extent cx="5334000" cy="1685925"/>
+            <wp:extent cx="5715000" cy="2343150"/>
             <wp:effectExtent t="0" r="0" b="0" l="0"/>
             <wp:docPr id="1" name="/home/user/lexfront-dfa-tokenizer/report/figures/subword.png" descr="/home/user/lexfront-dfa-tokenizer/report/figures/subword.png" title="/home/user/lexfront-dfa-tokenizer/report/figures/subword.png"/>
             <wp:cNvGraphicFramePr>
@@ -13986,7 +13986,7 @@
                   <pic:spPr bwMode="auto">
                     <a:xfrm>
                       <a:off x="0" y="0"/>
-                      <a:ext cx="5334000" cy="1685925"/>
+                      <a:ext cx="5715000" cy="2343150"/>
                     </a:xfrm>
                     <a:prstGeom prst="rect">
                       <a:avLst/>
@@ -20164,9 +20164,9 @@
       <w:r>
         <w:drawing>
           <wp:inline distT="0" distB="0" distL="0" distR="0">
-            <wp:extent cx="5143500" cy="1866900"/>
+            <wp:extent cx="5715000" cy="2076450"/>
             <wp:effectExtent t="0" r="0" b="0" l="0"/>
-            <wp:docPr id="1" name="/home/user/lexfront-dfa-tokenizer/results/figures/existing_vs_proposed.png" descr="/home/user/lexfront-dfa-tokenizer/results/figures/existing_vs_proposed.png" title="/home/user/lexfront-dfa-tokenizer/results/figures/existing_vs_proposed.png"/>
+            <wp:docPr id="1" name="/home/user/lexfront-dfa-tokenizer/report/figures/hq_existing_vs_proposed.png" descr="/home/user/lexfront-dfa-tokenizer/report/figures/hq_existing_vs_proposed.png" title="/home/user/lexfront-dfa-tokenizer/report/figures/hq_existing_vs_proposed.png"/>
             <wp:cNvGraphicFramePr>
               <a:graphicFrameLocks xmlns:a="http://schemas.openxmlformats.org/drawingml/2006/main" noChangeAspect="1"/>
             </wp:cNvGraphicFramePr>
@@ -20189,7 +20189,7 @@
                   <pic:spPr bwMode="auto">
                     <a:xfrm>
                       <a:off x="0" y="0"/>
-                      <a:ext cx="5143500" cy="1866900"/>
+                      <a:ext cx="5715000" cy="2076450"/>
                     </a:xfrm>
                     <a:prstGeom prst="rect">
                       <a:avLst/>
@@ -21534,7 +21534,7 @@
       <w:r>
         <w:drawing>
           <wp:inline distT="0" distB="0" distL="0" distR="0">
-            <wp:extent cx="4953000" cy="2752725"/>
+            <wp:extent cx="5334000" cy="3200400"/>
             <wp:effectExtent t="0" r="0" b="0" l="0"/>
             <wp:docPr id="1" name="/home/user/lexfront-dfa-tokenizer/report/figures/forest.png" descr="/home/user/lexfront-dfa-tokenizer/report/figures/forest.png" title="/home/user/lexfront-dfa-tokenizer/report/figures/forest.png"/>
             <wp:cNvGraphicFramePr>
@@ -21559,7 +21559,7 @@
                   <pic:spPr bwMode="auto">
                     <a:xfrm>
                       <a:off x="0" y="0"/>
-                      <a:ext cx="4953000" cy="2752725"/>
+                      <a:ext cx="5334000" cy="3200400"/>
                     </a:xfrm>
                     <a:prstGeom prst="rect">
                       <a:avLst/>
@@ -21629,9 +21629,9 @@
       <w:r>
         <w:drawing>
           <wp:inline distT="0" distB="0" distL="0" distR="0">
-            <wp:extent cx="5334000" cy="1524000"/>
+            <wp:extent cx="5715000" cy="1628775"/>
             <wp:effectExtent t="0" r="0" b="0" l="0"/>
-            <wp:docPr id="1" name="/home/user/lexfront-dfa-tokenizer/results/figures/intrinsic_metrics.png" descr="/home/user/lexfront-dfa-tokenizer/results/figures/intrinsic_metrics.png" title="/home/user/lexfront-dfa-tokenizer/results/figures/intrinsic_metrics.png"/>
+            <wp:docPr id="1" name="/home/user/lexfront-dfa-tokenizer/report/figures/hq_intrinsic_metrics.png" descr="/home/user/lexfront-dfa-tokenizer/report/figures/hq_intrinsic_metrics.png" title="/home/user/lexfront-dfa-tokenizer/report/figures/hq_intrinsic_metrics.png"/>
             <wp:cNvGraphicFramePr>
               <a:graphicFrameLocks xmlns:a="http://schemas.openxmlformats.org/drawingml/2006/main" noChangeAspect="1"/>
             </wp:cNvGraphicFramePr>
@@ -21654,7 +21654,7 @@
                   <pic:spPr bwMode="auto">
                     <a:xfrm>
                       <a:off x="0" y="0"/>
-                      <a:ext cx="5334000" cy="1524000"/>
+                      <a:ext cx="5715000" cy="1628775"/>
                     </a:xfrm>
                     <a:prstGeom prst="rect">
                       <a:avLst/>
@@ -21681,7 +21681,7 @@
           <w:sz w:val="20"/>
           <w:szCs w:val="20"/>
         </w:rPr>
-        <w:t xml:space="preserve">Figure 8. OOV rate, fertility and vocabulary size by tokenizer (results/figures/intrinsic_metrics.png)</w:t>
+        <w:t xml:space="preserve">Figure 8. OOV rate, fertility and vocabulary size by tokenizer (redrawn at 300 dpi from results/module2)</w:t>
       </w:r>
     </w:p>
     <w:p>

</xml_diff>